<commit_message>
Azure resources deployment scripts are updated. Interview questions document updated.
</commit_message>
<xml_diff>
--- a/InterviewQuestions/InterviewQstingByTopic/CSharp-OOPS-Tech-Qstins.docx
+++ b/InterviewQuestions/InterviewQstingByTopic/CSharp-OOPS-Tech-Qstins.docx
@@ -25,6 +25,44 @@
         </w:rPr>
         <w:t>C# - OOPS</w:t>
       </w:r>
+    </w:p>
+    <w:p>
+      <w:pPr>
+        <w:rPr>
+          <w:rFonts w:cstheme="minorHAnsi"/>
+          <w:b/>
+          <w:bCs/>
+          <w:sz w:val="24"/>
+          <w:szCs w:val="24"/>
+        </w:rPr>
+      </w:pPr>
+      <w:r>
+        <w:rPr>
+          <w:rFonts w:cstheme="minorHAnsi"/>
+          <w:sz w:val="24"/>
+          <w:szCs w:val="24"/>
+        </w:rPr>
+        <w:t xml:space="preserve">The four pillars of Object-Oriented Programming (OOP) in C# are </w:t>
+      </w:r>
+      <w:r>
+        <w:rPr>
+          <w:rFonts w:cstheme="minorHAnsi"/>
+          <w:b/>
+          <w:bCs/>
+          <w:sz w:val="24"/>
+          <w:szCs w:val="24"/>
+        </w:rPr>
+        <w:t>Encapsulation, Abstraction, Inheritance and Polymorphism.</w:t>
+      </w:r>
+    </w:p>
+    <w:p>
+      <w:pPr>
+        <w:rPr>
+          <w:rFonts w:cstheme="minorHAnsi"/>
+          <w:sz w:val="24"/>
+          <w:szCs w:val="24"/>
+        </w:rPr>
+      </w:pPr>
     </w:p>
     <w:p>
       <w:pPr>
@@ -810,6 +848,7 @@
         <w:t xml:space="preserve"> Each provides its own implementation of </w:t>
       </w:r>
       <w:proofErr w:type="spellStart"/>
+      <w:proofErr w:type="gramStart"/>
       <w:r>
         <w:rPr>
           <w:rFonts w:cstheme="minorHAnsi"/>
@@ -825,7 +864,16 @@
           <w:sz w:val="24"/>
           <w:szCs w:val="24"/>
         </w:rPr>
-        <w:t>().</w:t>
+        <w:t>(</w:t>
+      </w:r>
+      <w:proofErr w:type="gramEnd"/>
+      <w:r>
+        <w:rPr>
+          <w:rFonts w:cstheme="minorHAnsi"/>
+          <w:sz w:val="24"/>
+          <w:szCs w:val="24"/>
+        </w:rPr>
+        <w:t>).</w:t>
       </w:r>
     </w:p>
     <w:p>
@@ -1901,7 +1949,25 @@
           <w:sz w:val="24"/>
           <w:szCs w:val="24"/>
         </w:rPr>
-        <w:t>The beauty of abstraction: you don’t rewrite or modify existing payment classes, you just extend the system with a new one.</w:t>
+        <w:t xml:space="preserve">The beauty of abstraction: you don’t rewrite or modify existing payment </w:t>
+      </w:r>
+      <w:proofErr w:type="gramStart"/>
+      <w:r>
+        <w:rPr>
+          <w:rFonts w:cstheme="minorHAnsi"/>
+          <w:sz w:val="24"/>
+          <w:szCs w:val="24"/>
+        </w:rPr>
+        <w:t>classes,</w:t>
+      </w:r>
+      <w:proofErr w:type="gramEnd"/>
+      <w:r>
+        <w:rPr>
+          <w:rFonts w:cstheme="minorHAnsi"/>
+          <w:sz w:val="24"/>
+          <w:szCs w:val="24"/>
+        </w:rPr>
+        <w:t xml:space="preserve"> you just extend the system with a new one.</w:t>
       </w:r>
     </w:p>
     <w:p>
@@ -1968,6 +2034,7 @@
           <w:rFonts w:cstheme="minorHAnsi"/>
           <w:b/>
           <w:bCs/>
+          <w:noProof/>
         </w:rPr>
         <w:lastRenderedPageBreak/>
         <w:drawing>
@@ -2038,18 +2105,7 @@
           <w:szCs w:val="24"/>
           <w:highlight w:val="yellow"/>
         </w:rPr>
-        <w:t xml:space="preserve">Question: </w:t>
-      </w:r>
-      <w:r>
-        <w:rPr>
-          <w:rFonts w:cstheme="minorHAnsi"/>
-          <w:b/>
-          <w:bCs/>
-          <w:sz w:val="24"/>
-          <w:szCs w:val="24"/>
-          <w:highlight w:val="yellow"/>
-        </w:rPr>
-        <w:t>Abstract vs Dependency injection vs Factory pattern. Explain these with example code with real time use case. When to use what?</w:t>
+        <w:t>Question: Abstract vs Dependency injection vs Factory pattern. Explain these with example code with real time use case. When to use what?</w:t>
       </w:r>
     </w:p>
     <w:p>
@@ -2139,6 +2195,7 @@
       <w:r>
         <w:rPr>
           <w:rFonts w:cstheme="minorHAnsi"/>
+          <w:noProof/>
           <w:sz w:val="24"/>
           <w:szCs w:val="24"/>
         </w:rPr>
@@ -2190,6 +2247,7 @@
       <w:r>
         <w:rPr>
           <w:rFonts w:cstheme="minorHAnsi"/>
+          <w:noProof/>
           <w:sz w:val="24"/>
           <w:szCs w:val="24"/>
         </w:rPr>
@@ -2303,6 +2361,7 @@
       <w:r>
         <w:rPr>
           <w:rFonts w:cstheme="minorHAnsi"/>
+          <w:noProof/>
           <w:sz w:val="24"/>
           <w:szCs w:val="24"/>
         </w:rPr>
@@ -2354,6 +2413,7 @@
       <w:r>
         <w:rPr>
           <w:rFonts w:cstheme="minorHAnsi"/>
+          <w:noProof/>
           <w:sz w:val="24"/>
           <w:szCs w:val="24"/>
         </w:rPr>
@@ -2554,6 +2614,7 @@
       <w:r>
         <w:rPr>
           <w:rFonts w:cstheme="minorHAnsi"/>
+          <w:noProof/>
           <w:sz w:val="24"/>
           <w:szCs w:val="24"/>
         </w:rPr>
@@ -2606,6 +2667,7 @@
       <w:r>
         <w:rPr>
           <w:rFonts w:cstheme="minorHAnsi"/>
+          <w:noProof/>
           <w:sz w:val="24"/>
           <w:szCs w:val="24"/>
         </w:rPr>
@@ -2806,6 +2868,7 @@
       <w:r>
         <w:rPr>
           <w:rFonts w:cstheme="minorHAnsi"/>
+          <w:noProof/>
           <w:sz w:val="24"/>
           <w:szCs w:val="24"/>
         </w:rPr>
@@ -2857,6 +2920,7 @@
       <w:r>
         <w:rPr>
           <w:rFonts w:cstheme="minorHAnsi"/>
+          <w:noProof/>
           <w:sz w:val="24"/>
           <w:szCs w:val="24"/>
         </w:rPr>
@@ -3412,7 +3476,7 @@
           <w:szCs w:val="24"/>
         </w:rPr>
         <w:pict w14:anchorId="0F85D94B">
-          <v:rect id="_x0000_i1026" style="width:0;height:.75pt" o:hralign="center" o:hrstd="t" o:hr="t" fillcolor="#a0a0a0" stroked="f"/>
+          <v:rect id="_x0000_i1025" style="width:0;height:.75pt" o:hralign="center" o:hrstd="t" o:hr="t" fillcolor="#a0a0a0" stroked="f"/>
         </w:pict>
       </w:r>
     </w:p>
@@ -3512,7 +3576,7 @@
           <w:szCs w:val="24"/>
         </w:rPr>
         <w:pict w14:anchorId="1CEDD3F6">
-          <v:rect id="_x0000_i1027" style="width:0;height:.75pt" o:hralign="center" o:hrstd="t" o:hr="t" fillcolor="#a0a0a0" stroked="f"/>
+          <v:rect id="_x0000_i1026" style="width:0;height:.75pt" o:hralign="center" o:hrstd="t" o:hr="t" fillcolor="#a0a0a0" stroked="f"/>
         </w:pict>
       </w:r>
     </w:p>
@@ -3653,7 +3717,7 @@
           <w:szCs w:val="24"/>
         </w:rPr>
         <w:pict w14:anchorId="6AE9434E">
-          <v:rect id="_x0000_i1028" style="width:0;height:.75pt" o:hralign="center" o:hrstd="t" o:hr="t" fillcolor="#a0a0a0" stroked="f"/>
+          <v:rect id="_x0000_i1027" style="width:0;height:.75pt" o:hralign="center" o:hrstd="t" o:hr="t" fillcolor="#a0a0a0" stroked="f"/>
         </w:pict>
       </w:r>
     </w:p>
@@ -3987,7 +4051,7 @@
           <w:szCs w:val="24"/>
         </w:rPr>
         <w:pict w14:anchorId="19CD030F">
-          <v:rect id="_x0000_i1029" style="width:0;height:.75pt" o:hralign="center" o:hrstd="t" o:hr="t" fillcolor="#a0a0a0" stroked="f"/>
+          <v:rect id="_x0000_i1028" style="width:0;height:.75pt" o:hralign="center" o:hrstd="t" o:hr="t" fillcolor="#a0a0a0" stroked="f"/>
         </w:pict>
       </w:r>
     </w:p>
@@ -5789,6 +5853,7 @@
         <w:t>, such as </w:t>
       </w:r>
       <w:proofErr w:type="spellStart"/>
+      <w:proofErr w:type="gramStart"/>
       <w:r>
         <w:rPr>
           <w:rFonts w:cstheme="minorHAnsi"/>
@@ -5804,9 +5869,37 @@
           <w:sz w:val="24"/>
           <w:szCs w:val="24"/>
         </w:rPr>
-        <w:t>(), Equals(), </w:t>
+        <w:t>(</w:t>
+      </w:r>
+      <w:proofErr w:type="gramEnd"/>
+      <w:r>
+        <w:rPr>
+          <w:rFonts w:cstheme="minorHAnsi"/>
+          <w:sz w:val="24"/>
+          <w:szCs w:val="24"/>
+        </w:rPr>
+        <w:t>), </w:t>
+      </w:r>
+      <w:proofErr w:type="gramStart"/>
+      <w:r>
+        <w:rPr>
+          <w:rFonts w:cstheme="minorHAnsi"/>
+          <w:sz w:val="24"/>
+          <w:szCs w:val="24"/>
+        </w:rPr>
+        <w:t>Equals(</w:t>
+      </w:r>
+      <w:proofErr w:type="gramEnd"/>
+      <w:r>
+        <w:rPr>
+          <w:rFonts w:cstheme="minorHAnsi"/>
+          <w:sz w:val="24"/>
+          <w:szCs w:val="24"/>
+        </w:rPr>
+        <w:t>), </w:t>
       </w:r>
       <w:proofErr w:type="spellStart"/>
+      <w:proofErr w:type="gramStart"/>
       <w:r>
         <w:rPr>
           <w:rFonts w:cstheme="minorHAnsi"/>
@@ -5822,7 +5915,16 @@
           <w:sz w:val="24"/>
           <w:szCs w:val="24"/>
         </w:rPr>
-        <w:t>(), etc.</w:t>
+        <w:t>(</w:t>
+      </w:r>
+      <w:proofErr w:type="gramEnd"/>
+      <w:r>
+        <w:rPr>
+          <w:rFonts w:cstheme="minorHAnsi"/>
+          <w:sz w:val="24"/>
+          <w:szCs w:val="24"/>
+        </w:rPr>
+        <w:t>), etc.</w:t>
       </w:r>
     </w:p>
     <w:p>
@@ -6497,7 +6599,7 @@
           <w:szCs w:val="24"/>
         </w:rPr>
         <w:pict w14:anchorId="0092B3BD">
-          <v:rect id="_x0000_i1030" style="width:0;height:.75pt" o:hralign="center" o:hrstd="t" o:hr="t" fillcolor="#a0a0a0" stroked="f"/>
+          <v:rect id="_x0000_i1029" style="width:0;height:.75pt" o:hralign="center" o:hrstd="t" o:hr="t" fillcolor="#a0a0a0" stroked="f"/>
         </w:pict>
       </w:r>
     </w:p>
@@ -6618,7 +6720,7 @@
           <w:szCs w:val="24"/>
         </w:rPr>
         <w:pict w14:anchorId="170609C4">
-          <v:rect id="_x0000_i1031" style="width:0;height:.75pt" o:hralign="center" o:hrstd="t" o:hr="t" fillcolor="#a0a0a0" stroked="f"/>
+          <v:rect id="_x0000_i1030" style="width:0;height:.75pt" o:hralign="center" o:hrstd="t" o:hr="t" fillcolor="#a0a0a0" stroked="f"/>
         </w:pict>
       </w:r>
     </w:p>
@@ -6758,7 +6860,7 @@
           <w:szCs w:val="24"/>
         </w:rPr>
         <w:pict w14:anchorId="2C37E777">
-          <v:rect id="_x0000_i1032" style="width:0;height:.75pt" o:hralign="center" o:hrstd="t" o:hr="t" fillcolor="#a0a0a0" stroked="f"/>
+          <v:rect id="_x0000_i1031" style="width:0;height:.75pt" o:hralign="center" o:hrstd="t" o:hr="t" fillcolor="#a0a0a0" stroked="f"/>
         </w:pict>
       </w:r>
     </w:p>
@@ -6941,7 +7043,7 @@
           <w:szCs w:val="24"/>
         </w:rPr>
         <w:pict w14:anchorId="77B790B3">
-          <v:rect id="_x0000_i1033" style="width:0;height:.75pt" o:hralign="center" o:hrstd="t" o:hr="t" fillcolor="#a0a0a0" stroked="f"/>
+          <v:rect id="_x0000_i1032" style="width:0;height:.75pt" o:hralign="center" o:hrstd="t" o:hr="t" fillcolor="#a0a0a0" stroked="f"/>
         </w:pict>
       </w:r>
     </w:p>
@@ -7742,6 +7844,7 @@
         <w:t>You have a base class (Employee) with a virtual method </w:t>
       </w:r>
       <w:proofErr w:type="spellStart"/>
+      <w:proofErr w:type="gramStart"/>
       <w:r>
         <w:rPr>
           <w:rFonts w:cstheme="minorHAnsi"/>
@@ -7757,7 +7860,16 @@
           <w:sz w:val="24"/>
           <w:szCs w:val="24"/>
         </w:rPr>
-        <w:t>().</w:t>
+        <w:t>(</w:t>
+      </w:r>
+      <w:proofErr w:type="gramEnd"/>
+      <w:r>
+        <w:rPr>
+          <w:rFonts w:cstheme="minorHAnsi"/>
+          <w:sz w:val="24"/>
+          <w:szCs w:val="24"/>
+        </w:rPr>
+        <w:t>).</w:t>
       </w:r>
     </w:p>
     <w:p>
@@ -7880,6 +7992,7 @@
         <w:t>Polymorphism: When you call </w:t>
       </w:r>
       <w:proofErr w:type="spellStart"/>
+      <w:proofErr w:type="gramStart"/>
       <w:r>
         <w:rPr>
           <w:rFonts w:cstheme="minorHAnsi"/>
@@ -7895,7 +8008,16 @@
           <w:sz w:val="24"/>
           <w:szCs w:val="24"/>
         </w:rPr>
-        <w:t>() on a variable of type Employee, it will execute the derived class implementation if the object is of type </w:t>
+        <w:t>(</w:t>
+      </w:r>
+      <w:proofErr w:type="gramEnd"/>
+      <w:r>
+        <w:rPr>
+          <w:rFonts w:cstheme="minorHAnsi"/>
+          <w:sz w:val="24"/>
+          <w:szCs w:val="24"/>
+        </w:rPr>
+        <w:t>) on a variable of type Employee, it will execute the derived class implementation if the object is of type </w:t>
       </w:r>
       <w:proofErr w:type="spellStart"/>
       <w:r>
@@ -8023,6 +8145,7 @@
         <w:t>The base class Employee defines a virtual method </w:t>
       </w:r>
       <w:proofErr w:type="spellStart"/>
+      <w:proofErr w:type="gramStart"/>
       <w:r>
         <w:rPr>
           <w:rFonts w:cstheme="minorHAnsi"/>
@@ -8038,7 +8161,16 @@
           <w:sz w:val="24"/>
           <w:szCs w:val="24"/>
         </w:rPr>
-        <w:t>().</w:t>
+        <w:t>(</w:t>
+      </w:r>
+      <w:proofErr w:type="gramEnd"/>
+      <w:r>
+        <w:rPr>
+          <w:rFonts w:cstheme="minorHAnsi"/>
+          <w:sz w:val="24"/>
+          <w:szCs w:val="24"/>
+        </w:rPr>
+        <w:t>).</w:t>
       </w:r>
     </w:p>
     <w:p>
@@ -8115,6 +8247,7 @@
         <w:t>When you call </w:t>
       </w:r>
       <w:proofErr w:type="spellStart"/>
+      <w:proofErr w:type="gramStart"/>
       <w:r>
         <w:rPr>
           <w:rFonts w:cstheme="minorHAnsi"/>
@@ -8130,7 +8263,16 @@
           <w:sz w:val="24"/>
           <w:szCs w:val="24"/>
         </w:rPr>
-        <w:t>() on a base class reference that points to a derived class object, the </w:t>
+        <w:t>(</w:t>
+      </w:r>
+      <w:proofErr w:type="gramEnd"/>
+      <w:r>
+        <w:rPr>
+          <w:rFonts w:cstheme="minorHAnsi"/>
+          <w:sz w:val="24"/>
+          <w:szCs w:val="24"/>
+        </w:rPr>
+        <w:t>) on a base class reference that points to a derived class object, the </w:t>
       </w:r>
       <w:r>
         <w:rPr>
@@ -8489,6 +8631,7 @@
         <w:t>If in the future you want to add new employee types with different calculations, you can simply create new subclasses and override </w:t>
       </w:r>
       <w:proofErr w:type="spellStart"/>
+      <w:proofErr w:type="gramStart"/>
       <w:r>
         <w:rPr>
           <w:rFonts w:cstheme="minorHAnsi"/>
@@ -8504,7 +8647,16 @@
           <w:sz w:val="24"/>
           <w:szCs w:val="24"/>
         </w:rPr>
-        <w:t>():</w:t>
+        <w:t>(</w:t>
+      </w:r>
+      <w:proofErr w:type="gramEnd"/>
+      <w:r>
+        <w:rPr>
+          <w:rFonts w:cstheme="minorHAnsi"/>
+          <w:sz w:val="24"/>
+          <w:szCs w:val="24"/>
+        </w:rPr>
+        <w:t>):</w:t>
       </w:r>
     </w:p>
     <w:p>
@@ -8643,7 +8795,7 @@
           <w:szCs w:val="24"/>
         </w:rPr>
         <w:pict w14:anchorId="71B99C7A">
-          <v:rect id="_x0000_i1034" style="width:0;height:.75pt" o:hralign="center" o:hrstd="t" o:hr="t" fillcolor="#a0a0a0" stroked="f"/>
+          <v:rect id="_x0000_i1033" style="width:0;height:.75pt" o:hralign="center" o:hrstd="t" o:hr="t" fillcolor="#a0a0a0" stroked="f"/>
         </w:pict>
       </w:r>
     </w:p>
@@ -8960,7 +9112,27 @@
           <w:sz w:val="24"/>
           <w:szCs w:val="24"/>
         </w:rPr>
-        <w:t xml:space="preserve"> = new A(); </w:t>
+        <w:t xml:space="preserve"> = new </w:t>
+      </w:r>
+      <w:proofErr w:type="gramStart"/>
+      <w:r>
+        <w:rPr>
+          <w:rFonts w:cstheme="minorHAnsi"/>
+          <w:color w:val="EE0000"/>
+          <w:sz w:val="24"/>
+          <w:szCs w:val="24"/>
+        </w:rPr>
+        <w:t>A(</w:t>
+      </w:r>
+      <w:proofErr w:type="gramEnd"/>
+      <w:r>
+        <w:rPr>
+          <w:rFonts w:cstheme="minorHAnsi"/>
+          <w:color w:val="EE0000"/>
+          <w:sz w:val="24"/>
+          <w:szCs w:val="24"/>
+        </w:rPr>
+        <w:t>); </w:t>
       </w:r>
       <w:r>
         <w:rPr>
@@ -9018,7 +9190,27 @@
           <w:sz w:val="24"/>
           <w:szCs w:val="24"/>
         </w:rPr>
-        <w:t xml:space="preserve"> = new B(); </w:t>
+        <w:t xml:space="preserve"> = new </w:t>
+      </w:r>
+      <w:proofErr w:type="gramStart"/>
+      <w:r>
+        <w:rPr>
+          <w:rFonts w:cstheme="minorHAnsi"/>
+          <w:color w:val="EE0000"/>
+          <w:sz w:val="24"/>
+          <w:szCs w:val="24"/>
+        </w:rPr>
+        <w:t>B(</w:t>
+      </w:r>
+      <w:proofErr w:type="gramEnd"/>
+      <w:r>
+        <w:rPr>
+          <w:rFonts w:cstheme="minorHAnsi"/>
+          <w:color w:val="EE0000"/>
+          <w:sz w:val="24"/>
+          <w:szCs w:val="24"/>
+        </w:rPr>
+        <w:t>); </w:t>
       </w:r>
       <w:r>
         <w:rPr>
@@ -9283,6 +9475,7 @@
           <w:szCs w:val="24"/>
         </w:rPr>
       </w:pPr>
+      <w:proofErr w:type="gramStart"/>
       <w:r>
         <w:rPr>
           <w:rFonts w:cstheme="minorHAnsi"/>
@@ -9290,7 +9483,34 @@
           <w:szCs w:val="24"/>
         </w:rPr>
         <w:lastRenderedPageBreak/>
-        <w:t>A objA2 = new B();</w:t>
+        <w:t>A</w:t>
+      </w:r>
+      <w:proofErr w:type="gramEnd"/>
+      <w:r>
+        <w:rPr>
+          <w:rFonts w:cstheme="minorHAnsi"/>
+          <w:sz w:val="24"/>
+          <w:szCs w:val="24"/>
+        </w:rPr>
+        <w:t xml:space="preserve"> objA2 = new </w:t>
+      </w:r>
+      <w:proofErr w:type="gramStart"/>
+      <w:r>
+        <w:rPr>
+          <w:rFonts w:cstheme="minorHAnsi"/>
+          <w:sz w:val="24"/>
+          <w:szCs w:val="24"/>
+        </w:rPr>
+        <w:t>B(</w:t>
+      </w:r>
+      <w:proofErr w:type="gramEnd"/>
+      <w:r>
+        <w:rPr>
+          <w:rFonts w:cstheme="minorHAnsi"/>
+          <w:sz w:val="24"/>
+          <w:szCs w:val="24"/>
+        </w:rPr>
+        <w:t>);</w:t>
       </w:r>
     </w:p>
     <w:p>
@@ -9356,6 +9576,7 @@
         <w:t>Since </w:t>
       </w:r>
       <w:proofErr w:type="spellStart"/>
+      <w:proofErr w:type="gramStart"/>
       <w:r>
         <w:rPr>
           <w:rFonts w:cstheme="minorHAnsi"/>
@@ -9371,7 +9592,16 @@
           <w:sz w:val="24"/>
           <w:szCs w:val="24"/>
         </w:rPr>
-        <w:t>() is marked as virtual in class A and overridden in class B, C# uses runtime polymorphism (also called dynamic dispatch) to decide which method to run.</w:t>
+        <w:t>(</w:t>
+      </w:r>
+      <w:proofErr w:type="gramEnd"/>
+      <w:r>
+        <w:rPr>
+          <w:rFonts w:cstheme="minorHAnsi"/>
+          <w:sz w:val="24"/>
+          <w:szCs w:val="24"/>
+        </w:rPr>
+        <w:t>) is marked as virtual in class A and overridden in class B, C# uses runtime polymorphism (also called dynamic dispatch) to decide which method to run.</w:t>
       </w:r>
     </w:p>
     <w:p>
@@ -9549,7 +9779,25 @@
           <w:sz w:val="24"/>
           <w:szCs w:val="24"/>
         </w:rPr>
-        <w:t>That’s why new B() causes Class B Method to be printed even though the reference is declared as type A.</w:t>
+        <w:t xml:space="preserve">That’s why new </w:t>
+      </w:r>
+      <w:proofErr w:type="gramStart"/>
+      <w:r>
+        <w:rPr>
+          <w:rFonts w:cstheme="minorHAnsi"/>
+          <w:sz w:val="24"/>
+          <w:szCs w:val="24"/>
+        </w:rPr>
+        <w:t>B(</w:t>
+      </w:r>
+      <w:proofErr w:type="gramEnd"/>
+      <w:r>
+        <w:rPr>
+          <w:rFonts w:cstheme="minorHAnsi"/>
+          <w:sz w:val="24"/>
+          <w:szCs w:val="24"/>
+        </w:rPr>
+        <w:t>) causes Class B Method to be printed even though the reference is declared as type A.</w:t>
       </w:r>
     </w:p>
     <w:p>
@@ -10372,7 +10620,43 @@
           <w:sz w:val="24"/>
           <w:szCs w:val="24"/>
         </w:rPr>
-        <w:t>Consider a shape drawing application: an abstract class Shape can define an abstract method Draw(). Specific shapes like Circle and Rectangle inherit from Shape and implement the Draw() method differently. This enforces a common interface and allows polymorphism.</w:t>
+        <w:t>Consider a shape drawing application: an abstract class Shape can define an abstract method </w:t>
+      </w:r>
+      <w:proofErr w:type="gramStart"/>
+      <w:r>
+        <w:rPr>
+          <w:rFonts w:cstheme="minorHAnsi"/>
+          <w:sz w:val="24"/>
+          <w:szCs w:val="24"/>
+        </w:rPr>
+        <w:t>Draw(</w:t>
+      </w:r>
+      <w:proofErr w:type="gramEnd"/>
+      <w:r>
+        <w:rPr>
+          <w:rFonts w:cstheme="minorHAnsi"/>
+          <w:sz w:val="24"/>
+          <w:szCs w:val="24"/>
+        </w:rPr>
+        <w:t>). Specific shapes like Circle and Rectangle inherit from Shape and implement the </w:t>
+      </w:r>
+      <w:proofErr w:type="gramStart"/>
+      <w:r>
+        <w:rPr>
+          <w:rFonts w:cstheme="minorHAnsi"/>
+          <w:sz w:val="24"/>
+          <w:szCs w:val="24"/>
+        </w:rPr>
+        <w:t>Draw(</w:t>
+      </w:r>
+      <w:proofErr w:type="gramEnd"/>
+      <w:r>
+        <w:rPr>
+          <w:rFonts w:cstheme="minorHAnsi"/>
+          <w:sz w:val="24"/>
+          <w:szCs w:val="24"/>
+        </w:rPr>
+        <w:t>) method differently. This enforces a common interface and allows polymorphism.</w:t>
       </w:r>
     </w:p>
     <w:p>
@@ -10769,7 +11053,25 @@
           <w:sz w:val="24"/>
           <w:szCs w:val="24"/>
         </w:rPr>
-        <w:t>Example: In an Employee class, the company name can be static (shared by all employees), while the employee's ID or name is instance-specific.</w:t>
+        <w:t xml:space="preserve">Example: In an </w:t>
+      </w:r>
+      <w:proofErr w:type="gramStart"/>
+      <w:r>
+        <w:rPr>
+          <w:rFonts w:cstheme="minorHAnsi"/>
+          <w:sz w:val="24"/>
+          <w:szCs w:val="24"/>
+        </w:rPr>
+        <w:t>Employee</w:t>
+      </w:r>
+      <w:proofErr w:type="gramEnd"/>
+      <w:r>
+        <w:rPr>
+          <w:rFonts w:cstheme="minorHAnsi"/>
+          <w:sz w:val="24"/>
+          <w:szCs w:val="24"/>
+        </w:rPr>
+        <w:t xml:space="preserve"> class, the company name can be static (shared by all employees), while the employee's ID or name is instance-specific.</w:t>
       </w:r>
     </w:p>
     <w:p>
@@ -11443,6 +11745,7 @@
         <w:t xml:space="preserve">Sealed classes contrast with abstract classes, which are meant to be inherited and extended. Sealed classes ensure that the class is final in the inheritance chain and cannot be further modified by </w:t>
       </w:r>
       <w:proofErr w:type="spellStart"/>
+      <w:proofErr w:type="gramStart"/>
       <w:r>
         <w:rPr>
           <w:rFonts w:cstheme="minorHAnsi"/>
@@ -11452,6 +11755,7 @@
         <w:t>subclassing.Sealed</w:t>
       </w:r>
       <w:proofErr w:type="spellEnd"/>
+      <w:proofErr w:type="gramEnd"/>
       <w:r>
         <w:rPr>
           <w:rFonts w:cstheme="minorHAnsi"/>
@@ -13739,7 +14043,7 @@
           <w:szCs w:val="24"/>
         </w:rPr>
         <w:pict w14:anchorId="572DE3B1">
-          <v:rect id="_x0000_i1035" style="width:0;height:.75pt" o:hralign="center" o:hrstd="t" o:hr="t" fillcolor="#a0a0a0" stroked="f"/>
+          <v:rect id="_x0000_i1034" style="width:0;height:.75pt" o:hralign="center" o:hrstd="t" o:hr="t" fillcolor="#a0a0a0" stroked="f"/>
         </w:pict>
       </w:r>
     </w:p>
@@ -13865,7 +14169,7 @@
           <w:szCs w:val="24"/>
         </w:rPr>
         <w:pict w14:anchorId="1684EF92">
-          <v:rect id="_x0000_i1036" style="width:0;height:.75pt" o:hralign="center" o:hrstd="t" o:hr="t" fillcolor="#a0a0a0" stroked="f"/>
+          <v:rect id="_x0000_i1035" style="width:0;height:.75pt" o:hralign="center" o:hrstd="t" o:hr="t" fillcolor="#a0a0a0" stroked="f"/>
         </w:pict>
       </w:r>
     </w:p>
@@ -14024,7 +14328,7 @@
           <w:szCs w:val="24"/>
         </w:rPr>
         <w:pict w14:anchorId="04E76798">
-          <v:rect id="_x0000_i1037" style="width:0;height:.75pt" o:hralign="center" o:hrstd="t" o:hr="t" fillcolor="#a0a0a0" stroked="f"/>
+          <v:rect id="_x0000_i1036" style="width:0;height:.75pt" o:hralign="center" o:hrstd="t" o:hr="t" fillcolor="#a0a0a0" stroked="f"/>
         </w:pict>
       </w:r>
     </w:p>
@@ -15526,7 +15830,7 @@
           <w:szCs w:val="24"/>
         </w:rPr>
         <w:pict w14:anchorId="2E0CFD3E">
-          <v:rect id="_x0000_i1038" style="width:0;height:.75pt" o:hralign="center" o:hrstd="t" o:hr="t" fillcolor="#a0a0a0" stroked="f"/>
+          <v:rect id="_x0000_i1037" style="width:0;height:.75pt" o:hralign="center" o:hrstd="t" o:hr="t" fillcolor="#a0a0a0" stroked="f"/>
         </w:pict>
       </w:r>
     </w:p>
@@ -15947,7 +16251,25 @@
           <w:szCs w:val="24"/>
         </w:rPr>
         <w:br/>
-        <w:t>The GC updates references to objects that will be relocated during compaction.</w:t>
+        <w:t xml:space="preserve">The GC updates </w:t>
+      </w:r>
+      <w:proofErr w:type="gramStart"/>
+      <w:r>
+        <w:rPr>
+          <w:rFonts w:cstheme="minorHAnsi"/>
+          <w:sz w:val="24"/>
+          <w:szCs w:val="24"/>
+        </w:rPr>
+        <w:t>references</w:t>
+      </w:r>
+      <w:proofErr w:type="gramEnd"/>
+      <w:r>
+        <w:rPr>
+          <w:rFonts w:cstheme="minorHAnsi"/>
+          <w:sz w:val="24"/>
+          <w:szCs w:val="24"/>
+        </w:rPr>
+        <w:t xml:space="preserve"> to objects that will be relocated during compaction.</w:t>
       </w:r>
     </w:p>
     <w:p>
@@ -16086,7 +16408,7 @@
           <w:szCs w:val="24"/>
         </w:rPr>
         <w:pict w14:anchorId="435BF6BC">
-          <v:rect id="_x0000_i1039" style="width:0;height:.75pt" o:hralign="center" o:hrstd="t" o:hr="t" fillcolor="#a0a0a0" stroked="f"/>
+          <v:rect id="_x0000_i1038" style="width:0;height:.75pt" o:hralign="center" o:hrstd="t" o:hr="t" fillcolor="#a0a0a0" stroked="f"/>
         </w:pict>
       </w:r>
     </w:p>
@@ -16333,7 +16655,7 @@
           <w:szCs w:val="24"/>
         </w:rPr>
         <w:pict w14:anchorId="3A156184">
-          <v:rect id="_x0000_i1040" style="width:0;height:.75pt" o:hralign="center" o:hrstd="t" o:hr="t" fillcolor="#a0a0a0" stroked="f"/>
+          <v:rect id="_x0000_i1039" style="width:0;height:.75pt" o:hralign="center" o:hrstd="t" o:hr="t" fillcolor="#a0a0a0" stroked="f"/>
         </w:pict>
       </w:r>
     </w:p>
@@ -16372,7 +16694,25 @@
           <w:sz w:val="24"/>
           <w:szCs w:val="24"/>
         </w:rPr>
-        <w:t>.NET 8 adds features like DATAS (Dynamic Adaptation To Application Sizes) in server GC mode for better memory and performance optimization according to application needs.</w:t>
+        <w:t xml:space="preserve">.NET 8 adds features like DATAS (Dynamic Adaptation </w:t>
+      </w:r>
+      <w:proofErr w:type="gramStart"/>
+      <w:r>
+        <w:rPr>
+          <w:rFonts w:cstheme="minorHAnsi"/>
+          <w:sz w:val="24"/>
+          <w:szCs w:val="24"/>
+        </w:rPr>
+        <w:t>To</w:t>
+      </w:r>
+      <w:proofErr w:type="gramEnd"/>
+      <w:r>
+        <w:rPr>
+          <w:rFonts w:cstheme="minorHAnsi"/>
+          <w:sz w:val="24"/>
+          <w:szCs w:val="24"/>
+        </w:rPr>
+        <w:t xml:space="preserve"> Application Sizes) in server GC mode for better memory and performance optimization according to application needs.</w:t>
       </w:r>
     </w:p>
     <w:p>
@@ -16432,7 +16772,7 @@
           <w:szCs w:val="24"/>
         </w:rPr>
         <w:pict w14:anchorId="614AC8E9">
-          <v:rect id="_x0000_i1041" style="width:0;height:.75pt" o:hralign="center" o:hrstd="t" o:hr="t" fillcolor="#a0a0a0" stroked="f"/>
+          <v:rect id="_x0000_i1040" style="width:0;height:.75pt" o:hralign="center" o:hrstd="t" o:hr="t" fillcolor="#a0a0a0" stroked="f"/>
         </w:pict>
       </w:r>
     </w:p>
@@ -16583,6 +16923,7 @@
         <w:t> need to call </w:t>
       </w:r>
       <w:proofErr w:type="spellStart"/>
+      <w:proofErr w:type="gramStart"/>
       <w:r>
         <w:rPr>
           <w:rFonts w:cstheme="minorHAnsi"/>
@@ -16592,6 +16933,7 @@
         <w:t>GC.Collect</w:t>
       </w:r>
       <w:proofErr w:type="spellEnd"/>
+      <w:proofErr w:type="gramEnd"/>
       <w:r>
         <w:rPr>
           <w:rFonts w:cstheme="minorHAnsi"/>

</xml_diff>